<commit_message>
added link to github repository with the project
</commit_message>
<xml_diff>
--- a/Project_description.docx
+++ b/Project_description.docx
@@ -35,13 +35,56 @@
     </w:p>
     <w:p>
       <w:pPr>
-        <w:jc w:val="center"/>
         <w:rPr>
           <w:b/>
           <w:bCs/>
         </w:rPr>
       </w:pPr>
+      <w:r>
+        <w:rPr>
+          <w:b/>
+          <w:bCs/>
+        </w:rPr>
+        <w:t>GitHub:</w:t>
+      </w:r>
+      <w:r>
+        <w:t xml:space="preserve"> </w:t>
+      </w:r>
       <w:hyperlink r:id="rId5" w:history="1">
+        <w:r>
+          <w:rPr>
+            <w:rStyle w:val="Hyperlink"/>
+            <w:b/>
+            <w:bCs/>
+          </w:rPr>
+          <w:t>https://github.com/Sofya-Zats/Uber_rides_cancellation_predictor</w:t>
+        </w:r>
+      </w:hyperlink>
+    </w:p>
+    <w:p>
+      <w:pPr>
+        <w:rPr>
+          <w:b/>
+          <w:bCs/>
+        </w:rPr>
+      </w:pPr>
+      <w:proofErr w:type="spellStart"/>
+      <w:r>
+        <w:rPr>
+          <w:b/>
+          <w:bCs/>
+        </w:rPr>
+        <w:t>Streamlit</w:t>
+      </w:r>
+      <w:proofErr w:type="spellEnd"/>
+      <w:r>
+        <w:rPr>
+          <w:b/>
+          <w:bCs/>
+        </w:rPr>
+        <w:t xml:space="preserve">: </w:t>
+      </w:r>
+      <w:hyperlink r:id="rId6" w:history="1">
         <w:r>
           <w:rPr>
             <w:rStyle w:val="Hyperlink"/>
@@ -54,16 +97,6 @@
     </w:p>
     <w:p>
       <w:pPr>
-        <w:jc w:val="center"/>
-        <w:rPr>
-          <w:b/>
-          <w:bCs/>
-        </w:rPr>
-      </w:pPr>
-    </w:p>
-    <w:p>
-      <w:pPr>
-        <w:jc w:val="center"/>
         <w:rPr>
           <w:b/>
           <w:bCs/>

</xml_diff>